<commit_message>
Manuscript v2 (EN): operational title, H1 replication (3.4), corrected DD narrative with 2x2 decomposition (Table 6), MuSiC reframed, GBM limma sensitivity
</commit_message>
<xml_diff>
--- a/manuscript/drafts/manuscript_scenarioB_EN.docx
+++ b/manuscript/drafts/manuscript_scenarioB_EN.docx
@@ -2,7 +2,7 @@
 <file path=word/document.xml><?xml version="1.0" encoding="utf-8"?>
 <w:document xmlns:w="http://schemas.openxmlformats.org/wordprocessingml/2006/main" xmlns:m="http://schemas.openxmlformats.org/officeDocument/2006/math" xmlns:r="http://schemas.openxmlformats.org/officeDocument/2006/relationships" xmlns:o="urn:schemas-microsoft-com:office:office" xmlns:v="urn:schemas-microsoft-com:vml" xmlns:w10="urn:schemas-microsoft-com:office:word" xmlns:a="http://schemas.openxmlformats.org/drawingml/2006/main" xmlns:pic="http://schemas.openxmlformats.org/drawingml/2006/picture" xmlns:wp="http://schemas.openxmlformats.org/drawingml/2006/wordprocessingDrawing">
   <w:body>
-    <w:bookmarkStart w:id="50" w:name="Xcea9292191d5b9d165ad59cf107bee9c464e45e"/>
+    <w:bookmarkStart w:id="51" w:name="X1561019e2b3943cac2a414e782fad96d1ee90c2"/>
     <w:p>
       <w:pPr>
         <w:pStyle w:val="Heading1"/>
@@ -12,7 +12,7 @@
         <w:rPr>
           <w:sz w:val="32"/>
         </w:rPr>
-        <w:t xml:space="preserve">Shared transcriptomic signatures of Alzheimer’s disease and glioblastoma dissolve under cell-composition control: a pre-specified re-evaluation</w:t>
+        <w:t xml:space="preserve">Shared transcriptomic signatures of Alzheimer’s disease and glioblastoma do not survive adjustment for estimated cell composition: a pre-specified re-evaluation</w:t>
       </w:r>
     </w:p>
     <w:p>
@@ -72,7 +72,7 @@
         <w:t xml:space="preserve"> </w:t>
       </w:r>
       <w:r>
-        <w:t xml:space="preserve">People with Alzheimer’s disease (AD) develop cancer less often than expected, and this inverse relationship has motivated searches for transcriptomic signatures shared between AD and glioblastoma (GBM). In both diseases, however, the cellular make-up of the tissue changes a great deal, so genes that appear to change together in bulk tissue may simply track shifts in cell composition.</w:t>
+        <w:t xml:space="preserve">Alzheimer’s disease (AD) and cancer are inversely associated, which has motivated searches for transcriptomic signatures shared by AD and glioblastoma (GBM). Both diseases reshape the cellular make-up of brain tissue, so genes that change together in bulk samples may simply track cell composition.</w:t>
       </w:r>
     </w:p>
     <w:p>
@@ -90,7 +90,7 @@
         <w:t xml:space="preserve"> </w:t>
       </w:r>
       <w:r>
-        <w:t xml:space="preserve">I defined the hypotheses, thresholds and decision rules in a time-stamped analysis plan before analysing any data. For the primary hypothesis (H1), I compared shared differentially expressed genes (DEGs) between a hippocampal AD meta-cohort (n = 51) and a TCGA-GBM/GTEx cohort (152 tumours, 186 controls) in models with and without cell-composition covariates from two deconvolution methods (BRETIGEA and MuSiC). For the secondary hypothesis (H2), I tested whether a donor-level signature of vulnerable RORB+ entorhinal neurons in AD overlaps with the signature of neural-like malignant states in GBM, using three pre-specified tests. I audited the implementation against the plan and recorded every deviation.</w:t>
+        <w:t xml:space="preserve">Hypotheses, thresholds and decision rules were fixed in a time-stamped plan before analysis. For the primary hypothesis (H1), I compared shared differentially expressed genes (DEGs) between a hippocampal AD meta-cohort (n = 51) and TCGA-GBM/GTEx (152 tumours, 186 controls), with and without composition covariates from BRETIGEA and MuSiC, and repeated the test in an independent AD cohort (n = 195). For the secondary hypothesis (H2), I tested whether a donor-level signature of vulnerable RORB+ entorhinal neurons overlaps with GBM neural-like malignant states, using three pre-specified tests. Every deviation from the plan was recorded.</w:t>
       </w:r>
     </w:p>
     <w:p>
@@ -108,7 +108,7 @@
         <w:t xml:space="preserve"> </w:t>
       </w:r>
       <w:r>
-        <w:t xml:space="preserve">The 1,458 shared DEGs found without composition control fell to zero after adjustment with either method, so H1 was supported. A negative control with noise covariates showed that this loss was not due to reduced statistical power. H2 failed all three tests in the plan-conformant analysis and in every alternative analysis. A convergence-like signal seen in the original implementation came from treating samples from the same donor as independent (486 significant genes, falling to 0–27 under donor-level inference) and from omitting age as a covariate.</w:t>
+        <w:t xml:space="preserve">The 1,458 shared DEGs fell to zero with either adjustment, so H1 was supported; noise covariates did not reproduce this loss. In the independent cohort, adjustment kept 46% of AD DEGs but removed 93% of shared DEGs. With three donors per group, H2 failed all three tests in every analysis. A convergence-like signal in the original implementation disappeared when age was modelled but not when donor was modelled; pseudoreplication separately inflated significant genes (486, against 0–27 at donor level).</w:t>
       </w:r>
     </w:p>
     <w:p>
@@ -126,7 +126,7 @@
         <w:t xml:space="preserve"> </w:t>
       </w:r>
       <w:r>
-        <w:t xml:space="preserve">Shared bulk transcriptomic signatures of AD and GBM do not survive cell-composition control, and the available data show no detectable convergence at cell-type resolution. Cross-disease transcriptomic comparisons need composition control and donor-level inference.</w:t>
+        <w:t xml:space="preserve">Shared bulk signatures of AD and GBM did not survive adjustment for estimated cell composition, and no cell-type-level convergence was detectable with the donors available. Cross-disease comparisons need composition adjustment, donor-level inference and attention to confounding by age.</w:t>
       </w:r>
     </w:p>
     <w:p>
@@ -988,7 +988,7 @@
         <w:t xml:space="preserve">~ tumour + group</w:t>
       </w:r>
       <w:r>
-        <w:t xml:space="preserve">) using the edgeR quasi-likelihood F-test. The pseudobulk profiles were built from summed and rounded TPM values. I used the adult malignant cells from the Smart-seq2 data (GSM3828672) and converted the GEO values, stored as log2(TPM/10 + 1), back to linear TPM with 10 × (2^x − 1). The GEO archive (GSE131928_RAW.tar) contains only processed TPM matrices, so an analysis on raw counts was not possible. This is a limitation for a negative binomial model, which assumes counts. A gene entered the GBM neural-mimicry signature if its FDR was below 0.05 and its log2FC was above 0.5.</w:t>
+        <w:t xml:space="preserve">) using the edgeR quasi-likelihood F-test. The pseudobulk profiles were built from summed and rounded TPM values. I used the adult malignant cells from the Smart-seq2 data (GSM3828672) and converted the GEO values, stored as log2(TPM/10 + 1), back to linear TPM with 10 × (2^x − 1). The GEO archive (GSE131928_RAW.tar) contains only processed TPM matrices, so an analysis on raw counts was not possible. This is a limitation for a negative binomial model, which assumes counts, so I also ran a limma-trend sensitivity analysis on log-scaled TPM (Section 2.7). A gene entered the GBM neural-mimicry signature if its FDR was below 0.05 and its log2FC was above 0.5.</w:t>
       </w:r>
     </w:p>
     <w:bookmarkEnd w:id="25"/>
@@ -1384,13 +1384,13 @@
         <w:t xml:space="preserve">~ group + age + sex</w:t>
       </w:r>
       <w:r>
-        <w:t xml:space="preserve">, and I then added neuron, astrocyte and microglia marker scores (the mean z-score of each marker set) as covariates. The loading and preprocessing steps for this cohort are not yet in a script </w:t>
+        <w:t xml:space="preserve">, and I then added neuron, astrocyte and microglia marker scores (the mean z-score of each marker set) as covariates. The cohort as analysed is saved to disk by a script (R/12_build_gse125583_bulk.R), but the upstream download and log-CPM steps are not yet scripted </w:t>
       </w:r>
       <w:r>
         <w:rPr>
           <w:highlight w:val="yellow"/>
         </w:rPr>
-        <w:t>[CHECK: script to be added before submission]</w:t>
+        <w:t>[CHECK: loading script to be added before submission]</w:t>
       </w:r>
       <w:r>
         <w:rPr/>
@@ -1413,6 +1413,48 @@
       </w:r>
       <w:r>
         <w:t xml:space="preserve">To test whether the loss of shared DEGs in H1 reflects a loss of statistical power, or simply the effect of adding any data-derived covariates, I ran a two-arm negative control with rules defined before the results were seen. In arm 1, six independent standard normal variables were added to Model A. In arm 2, I added the first principal component scores of six random 50-gene sets drawn from all genes outside the BRETIGEA marker lists. Each arm had 1,000 iterations. The primary metric was retention of AD DEGs (the median number of AD DEGs per iteration divided by the number in Model A). In arm 2, I measured how much composition the random covariates captured as the mean R² from regressing each of the six BRETIGEA scores on the six random components. In arm 1, a retention of at least 0.80 meant power loss did not explain the decline, and a retention below 0.20 meant the decline was largely due to power loss. In arm 2, a median R² of at least 0.25 meant the arm could not discriminate; below 0.25, a retention below 0.20 would indicate a decline that is not specific to composition, and a retention of at least 0.80 one that is.</w:t>
+      </w:r>
+    </w:p>
+    <w:p>
+      <w:pPr>
+        <w:pStyle w:val="BodyText"/>
+      </w:pPr>
+      <w:r>
+        <w:rPr>
+          <w:iCs/>
+          <w:i/>
+        </w:rPr>
+        <w:t xml:space="preserve">Analyses added after external review.</w:t>
+      </w:r>
+      <w:r>
+        <w:t xml:space="preserve"> </w:t>
+      </w:r>
+      <w:r>
+        <w:t xml:space="preserve">After an external review of an earlier draft, I pre-declared and committed three further analyses before running them. (i) Replication of H1: the AD side of H1 was repeated in GSE125583 (advanced AD 125, controls 70), with Model A</w:t>
+      </w:r>
+      <w:r>
+        <w:t xml:space="preserve"> </w:t>
+      </w:r>
+      <w:r>
+        <w:rPr>
+          <w:rStyle w:val="VerbatimChar"/>
+        </w:rPr>
+        <w:t xml:space="preserve">~ diagnosis + sex + age</w:t>
+      </w:r>
+      <w:r>
+        <w:t xml:space="preserve"> </w:t>
+      </w:r>
+      <w:r>
+        <w:t xml:space="preserve">and Model B adding the six BRETIGEA scores, fitted with limma-trend; the GBM models were left unchanged. The shared-DEG ratio B/A was labelled as replicating H1 if at most 0.20, not replicating if at least 0.50, and partial otherwise. MuSiC was not run, for the reasons given in Section 3.1. (ii) A 2 × 2 decomposition of the original DD signal: with the Braak II versus Braak 0 contrast held fixed, the RRHO2 DD and DU maxima and the top-200 DD overlap were computed with and without donor modelling (donor-summed edgeR) and with and without age. All four cells are reported, without a decision rule. (iii) A GBM sensitivity analysis: the Neftel pseudobulk profiles were scaled to one million per sample, transformed as log2(x + 1) and fitted with limma-trend (</w:t>
+      </w:r>
+      <w:r>
+        <w:rPr>
+          <w:rStyle w:val="VerbatimChar"/>
+        </w:rPr>
+        <w:t xml:space="preserve">~ tumour + group</w:t>
+      </w:r>
+      <w:r>
+        <w:t xml:space="preserve">, robust empirical Bayes), and the three Stage 3 tests were re-run with the plan and deviation AD inputs and the same thresholds.</w:t>
       </w:r>
     </w:p>
     <w:bookmarkEnd w:id="28"/>
@@ -2640,24 +2682,52 @@
                 <w:rFonts w:ascii="Times New Roman" w:hAnsi="Times New Roman"/>
                 <w:sz w:val="20"/>
               </w:rPr>
-              <w:t xml:space="preserve">Shortened; the H2 clause removed</w:t>
-            </w:r>
-          </w:p>
-        </w:tc>
-        <w:tc>
-          <w:tcPr/>
-          <w:p>
-            <w:pPr>
-              <w:pStyle w:val="Compact"/>
-              <w:spacing w:line="240" w:lineRule="auto" w:after="0"/>
-              <w:jc w:val="left"/>
-            </w:pPr>
-            <w:r>
-              <w:rPr>
-                <w:rFonts w:ascii="Times New Roman" w:hAnsi="Times New Roman"/>
-                <w:sz w:val="20"/>
-              </w:rPr>
-              <w:t xml:space="preserve">Length; the H2 clause claimed more than a 6-donor analysis can support</w:t>
+              <w:t xml:space="preserve">Shortened; H2 clause removed; operational wording (</w:t>
+            </w:r>
+            <w:r>
+              <w:rPr>
+                <w:rFonts w:ascii="Times New Roman" w:hAnsi="Times New Roman"/>
+                <w:sz w:val="20"/>
+              </w:rPr>
+              <w:t xml:space="preserve">‘</w:t>
+            </w:r>
+            <w:r>
+              <w:rPr>
+                <w:rFonts w:ascii="Times New Roman" w:hAnsi="Times New Roman"/>
+                <w:sz w:val="20"/>
+              </w:rPr>
+              <w:t xml:space="preserve">adjustment for estimated cell composition</w:t>
+            </w:r>
+            <w:r>
+              <w:rPr>
+                <w:rFonts w:ascii="Times New Roman" w:hAnsi="Times New Roman"/>
+                <w:sz w:val="20"/>
+              </w:rPr>
+              <w:t xml:space="preserve">’</w:t>
+            </w:r>
+            <w:r>
+              <w:rPr>
+                <w:rFonts w:ascii="Times New Roman" w:hAnsi="Times New Roman"/>
+                <w:sz w:val="20"/>
+              </w:rPr>
+              <w:t xml:space="preserve">)</w:t>
+            </w:r>
+          </w:p>
+        </w:tc>
+        <w:tc>
+          <w:tcPr/>
+          <w:p>
+            <w:pPr>
+              <w:pStyle w:val="Compact"/>
+              <w:spacing w:line="240" w:lineRule="auto" w:after="0"/>
+              <w:jc w:val="left"/>
+            </w:pPr>
+            <w:r>
+              <w:rPr>
+                <w:rFonts w:ascii="Times New Roman" w:hAnsi="Times New Roman"/>
+                <w:sz w:val="20"/>
+              </w:rPr>
+              <w:t xml:space="preserve">Length; the H2 clause claimed more than a 6-donor analysis can support; composition specificity not shown</w:t>
             </w:r>
           </w:p>
         </w:tc>
@@ -2675,6 +2745,76 @@
                 <w:sz w:val="20"/>
               </w:rPr>
               <w:t xml:space="preserve">After results</w:t>
+            </w:r>
+          </w:p>
+        </w:tc>
+      </w:tr>
+      <w:tr>
+        <w:tc>
+          <w:tcPr/>
+          <w:p>
+            <w:pPr>
+              <w:pStyle w:val="Compact"/>
+              <w:spacing w:line="240" w:lineRule="auto" w:after="0"/>
+              <w:jc w:val="left"/>
+            </w:pPr>
+            <w:r>
+              <w:rPr>
+                <w:rFonts w:ascii="Times New Roman" w:hAnsi="Times New Roman"/>
+                <w:sz w:val="20"/>
+              </w:rPr>
+              <w:t xml:space="preserve">Not in the plan</w:t>
+            </w:r>
+          </w:p>
+        </w:tc>
+        <w:tc>
+          <w:tcPr/>
+          <w:p>
+            <w:pPr>
+              <w:pStyle w:val="Compact"/>
+              <w:spacing w:line="240" w:lineRule="auto" w:after="0"/>
+              <w:jc w:val="left"/>
+            </w:pPr>
+            <w:r>
+              <w:rPr>
+                <w:rFonts w:ascii="Times New Roman" w:hAnsi="Times New Roman"/>
+                <w:sz w:val="20"/>
+              </w:rPr>
+              <w:t xml:space="preserve">H1 replication in GSE125583; 2 × 2 DD decomposition; GBM limma-trend sensitivity</w:t>
+            </w:r>
+          </w:p>
+        </w:tc>
+        <w:tc>
+          <w:tcPr/>
+          <w:p>
+            <w:pPr>
+              <w:pStyle w:val="Compact"/>
+              <w:spacing w:line="240" w:lineRule="auto" w:after="0"/>
+              <w:jc w:val="left"/>
+            </w:pPr>
+            <w:r>
+              <w:rPr>
+                <w:rFonts w:ascii="Times New Roman" w:hAnsi="Times New Roman"/>
+                <w:sz w:val="20"/>
+              </w:rPr>
+              <w:t xml:space="preserve">External review</w:t>
+            </w:r>
+          </w:p>
+        </w:tc>
+        <w:tc>
+          <w:tcPr/>
+          <w:p>
+            <w:pPr>
+              <w:pStyle w:val="Compact"/>
+              <w:spacing w:line="240" w:lineRule="auto" w:after="0"/>
+              <w:jc w:val="left"/>
+            </w:pPr>
+            <w:r>
+              <w:rPr>
+                <w:rFonts w:ascii="Times New Roman" w:hAnsi="Times New Roman"/>
+                <w:sz w:val="20"/>
+              </w:rPr>
+              <w:t xml:space="preserve">Pre-declared before running</w:t>
             </w:r>
           </w:p>
         </w:tc>
@@ -2752,7 +2892,7 @@
     </w:tbl>
     <w:bookmarkEnd w:id="29"/>
     <w:bookmarkEnd w:id="30"/>
-    <w:bookmarkStart w:id="36" w:name="results"/>
+    <w:bookmarkStart w:id="37" w:name="results"/>
     <w:p>
       <w:pPr>
         <w:pStyle w:val="Heading2"/>
@@ -2766,7 +2906,7 @@
         <w:pStyle w:val="FirstParagraph"/>
       </w:pPr>
       <w:r>
-        <w:t xml:space="preserve">I first report the tests of the two pre-specified hypotheses (Sections 3.1–3.3) and then the exploratory analyses, which do not enter the hypothesis decisions (Sections 3.4–3.5). All numbers come from the facts sheet generated from the locked result files.</w:t>
+        <w:t xml:space="preserve">I first report the tests of the two pre-specified hypotheses (Sections 3.1–3.3) and then the exploratory analyses, which do not enter the hypothesis decisions (Sections 3.4–3.6). All numbers come from the facts sheet generated from the locked result files.</w:t>
       </w:r>
     </w:p>
     <w:bookmarkStart w:id="31" w:name="X96ac4f94a06840510e0fc7641785cffc51362ba"/>
@@ -3291,7 +3431,7 @@
         <w:pStyle w:val="BodyText"/>
       </w:pPr>
       <w:r>
-        <w:t xml:space="preserve">The two methods have their own problems here. The MuSiC proportions are not biologically plausible in either cohort (Figure 2B). In control hippocampus, neurons made up 0.9% of the estimated composition, endothelial cells 43% and microglia 31%; in GTEx control cortex the figures were 0.7%, 46% and 16%; and in GBM tumours, neurons were estimated at 0.0% and endothelial cells at 60%. The markers behind the BRETIGEA astrocyte score behaved inconsistently in the GBM cohort (for example, correlations with the score of −0.22 for AQP4, −0.27 for GFAP and +0.87 for ETNPPL), which fits with malignant AC-like cells expressing astrocyte markers. The composition adjustment on the GBM side may therefore only partly reflect the proportions of normal glial cells.</w:t>
+        <w:t xml:space="preserve">The two methods have their own problems here. The MuSiC proportions are not biologically plausible in either cohort (Figure 2B). In control hippocampus, neurons made up 0.9% of the estimated composition, endothelial cells 43% and microglia 31%; in GTEx control cortex the figures were 0.7%, 46% and 16%; and in GBM tumours, neurons were estimated at 0.0% and endothelial cells at 60%. The markers behind the BRETIGEA astrocyte score behaved inconsistently in the GBM cohort (for example, correlations with the score of −0.22 for AQP4, −0.27 for GFAP and +0.87 for ETNPPL), which fits with malignant AC-like cells expressing astrocyte markers. The composition adjustment on the GBM side may therefore only partly reflect the proportions of normal glial cells. Given how implausible the MuSiC estimates are, I report Model C because the decision rule requires a second method, not as independent confirmation; the evidence for H1 rests mainly on BRETIGEA and on the replication in Section 3.4.</w:t>
       </w:r>
     </w:p>
     <w:bookmarkEnd w:id="31"/>
@@ -3803,6 +3943,14 @@
         <w:t xml:space="preserve">The identical Test 2 and Test 3 results in the plan and deviation rows are a coincidence. The top 200 AD genes of the two contrasts share only 30 genes, and the overlapping sets differ; only the overlap counts (14) are equal. The top 200 genes selected for the hypergeometric test have a slightly lower median expression than all genes (logCPM 4.19 versus 4.57).</w:t>
       </w:r>
     </w:p>
+    <w:p>
+      <w:pPr>
+        <w:pStyle w:val="BodyText"/>
+      </w:pPr>
+      <w:r>
+        <w:t xml:space="preserve">The rejection does not depend on how the GBM signature was estimated. With limma-trend on log-scaled TPM instead of edgeR on rounded TPM, the GBM log2FC values correlated at r = 0.879 with the original ones, and H2 was again rejected in both the plan analysis (DU maximum 2.50, adjusted P = 1; odds ratio 1.52; permutation P = 0.098) and the deviation analysis (DU maximum 3.37, adjusted P = 0.788; odds ratio 1.40; permutation P = 0.157).</w:t>
+      </w:r>
+    </w:p>
     <w:bookmarkEnd w:id="32"/>
     <w:bookmarkStart w:id="33" w:name="X86e4b00608a0ba286f9dbfeae0b65df96fda2a1"/>
     <w:p>
@@ -3846,13 +3994,13 @@
       </w:r>
     </w:p>
     <w:bookmarkEnd w:id="33"/>
-    <w:bookmarkStart w:id="34" w:name="Xf2fa812e8c1011a0f337896da35e24a6802275f"/>
+    <w:bookmarkStart w:id="34" w:name="X2541854ce5690d0da2d51d826a2a2859799f730"/>
     <w:p>
       <w:pPr>
         <w:pStyle w:val="Heading3"/>
       </w:pPr>
       <w:r>
-        <w:t xml:space="preserve">3.4 Exploratory: the DD signal in the original analysis does not survive analytic corrections</w:t>
+        <w:t xml:space="preserve">3.4 Exploratory: H1 replicates in an independent AD cohort</w:t>
       </w:r>
     </w:p>
     <w:p>
@@ -3860,7 +4008,33 @@
         <w:pStyle w:val="FirstParagraph"/>
       </w:pPr>
       <w:r>
-        <w:t xml:space="preserve">The original Stage 1 implementation departed from the plan in three ways: it treated three subclusters from the same donor as independent samples (21 samples from seven donors), it left out the age covariate required by the plan, and it used Braak II versus Braak 0 as the primary contrast. It produced 486 significant genes and a visible signal in the DD quadrant in Stage 3 (Table 4, last row). I examined how this signal depends on those analytic choices (Figure 5).</w:t>
+        <w:t xml:space="preserve">In GSE125583 (125 advanced AD, 70 controls), Model A gave 9,306 AD DEGs, of which 3,912 were shared with GBM. With the BRETIGEA scores added, 4,242 AD DEGs remained (retention 0.456; diagnosis VIF 1.4), but only 288 shared DEGs did. The shared-DEG ratio was 0.074, below the pre-declared threshold of 0.20, so H1 replicated. With the fold-change thresholds, shared DEGs fell from 1,105 to 3 (ratio 0.003).</w:t>
+      </w:r>
+    </w:p>
+    <w:p>
+      <w:pPr>
+        <w:pStyle w:val="BodyText"/>
+      </w:pPr>
+      <w:r>
+        <w:t xml:space="preserve">Two things stand out. In this larger RNA-seq cohort, composition adjustment did not wipe out the disease signal: almost half of the AD DEGs survived. The complete loss seen in the 51-sample meta-cohort was therefore probably a feature of that small, ComBat-merged cohort. The shared genes, on the other hand, were lost far more often than DEGs in general. If they were a random subset, one would expect roughly a quarter of them to survive (0.456 in AD × 0.526 in GBM ≈ 0.24); in fact 7.4% did. This comparison was not pre-declared, but it suggests that the genes shared by AD and GBM lean on the composition axis much more heavily than the AD signal as a whole.</w:t>
+      </w:r>
+    </w:p>
+    <w:bookmarkEnd w:id="34"/>
+    <w:bookmarkStart w:id="35" w:name="X66ac2047e287e9b1a8ad10a2e80d7f370079ec4"/>
+    <w:p>
+      <w:pPr>
+        <w:pStyle w:val="Heading3"/>
+      </w:pPr>
+      <w:r>
+        <w:t xml:space="preserve">3.5 Exploratory: the DD signal in the original analysis does not survive adjustment for age</w:t>
+      </w:r>
+    </w:p>
+    <w:p>
+      <w:pPr>
+        <w:pStyle w:val="FirstParagraph"/>
+      </w:pPr>
+      <w:r>
+        <w:t xml:space="preserve">The original Stage 1 implementation departed from the plan in three ways: it treated three subclusters from the same donor as independent samples (21 samples from seven donors), it left out the age covariate required by the plan, and it used Braak II versus Braak 0 as the primary contrast. It produced 486 significant genes and a visible signal in the DD quadrant in Stage 3 (Table 4, last row). I examined how this signal and the gene counts depend on those analytic choices (Figure 5).</w:t>
       </w:r>
     </w:p>
     <w:p>
@@ -3896,7 +4070,7 @@
         <w:t xml:space="preserve"> </w:t>
       </w:r>
       <w:r>
-        <w:t xml:space="preserve">I repeated the four-quadrant overlap test at four thresholds fixed in advance (top 100, 200, 300 and 500 genes), using both the original and the donor-level ranking (Table 5; Figure 5C). With the original ranking, the DD quadrant was significant at three of the four thresholds (BH-adjusted P &lt; 0.05); with the donor-level ranking, it was significant at only one (top 300 genes). The DU quadrant was significant at three thresholds with the donor-level ranking, but its highest odds ratio (2.42 for the top 200 genes) stayed below the pre-specified H2 threshold of 3. That the DD and DU quadrants are enriched at the same time suggests that genes down in AD are over-represented at both ends of the GBM ranking. This pattern may reflect genes that tend to take extreme values in both datasets, not a directional convergence.</w:t>
+        <w:t xml:space="preserve">I repeated the four-quadrant overlap test at four thresholds fixed in advance (top 100, 200, 300 and 500 genes), using both the original ranking and a donor-level ranking from limma-voom with a donor block (Table 5; Figure 5C). With the original ranking, the DD quadrant was significant at three of the four thresholds (BH-adjusted P &lt; 0.05); with the donor-block ranking, it was significant at only one (top 300 genes). The DU quadrant was significant at three thresholds with the donor-level ranking, but its highest odds ratio (2.42 for the top 200 genes) stayed below the pre-specified H2 threshold of 3. That the DD and DU quadrants are enriched at the same time suggests that genes down in AD are over-represented at both ends of the GBM ranking. This pattern may reflect genes that tend to take extreme values in both datasets, not a directional convergence.</w:t>
       </w:r>
     </w:p>
     <w:p>
@@ -4392,13 +4566,13 @@
           <w:iCs/>
           <w:i/>
         </w:rPr>
-        <w:t xml:space="preserve">Age and the plan-conformant ranking.</w:t>
+        <w:t xml:space="preserve">Donor modelling versus age.</w:t>
       </w:r>
       <w:r>
         <w:t xml:space="preserve"> </w:t>
       </w:r>
       <w:r>
-        <w:t xml:space="preserve">In the Leng cohort, the age ranges of the Braak II and Braak 0 groups do not overlap (Braak 0: 50–71; Braak II: 72–91; r = 0.80; VIF = 2.74). Keeping the Braak II contrast but adding donor-level inference and age, the highest value of the DD quadrant on the RRHO2 map dropped from 6.54 to 1.48 (adjusted P = 1; Figure 5D). The Spearman correlation between the plan-conformant Braak VI ranking and the original ranking was 0.584. I therefore regard the DD signal in the original analysis as the combined product of pseudoreplication and the omitted age covariate.</w:t>
+        <w:t xml:space="preserve">To separate the two corrections, I held the Braak II versus Braak 0 contrast fixed and varied donor modelling and age independently (Table 6). Modelling donor on its own did not remove the DD signal; with donor-summed counts it was, if anything, slightly stronger (RRHO2 DD maximum 7.25; top-200 overlap 21 against 10.4 expected, P = 0.001). Adding age removed it whether or not donor was modelled (DD maximum 1.29 and 1.48; overlaps 9 and 8). The weakening seen with the donor-block ranking in Table 5 is therefore specific to that method. What removes the DD signal is the age term.</w:t>
       </w:r>
     </w:p>
     <w:p>
@@ -4406,17 +4580,509 @@
         <w:pStyle w:val="BodyText"/>
       </w:pPr>
       <w:r>
-        <w:t xml:space="preserve">One further note. As recorded in the register, adding age to the original analysis while keeping its pseudoreplicated design reduced the number of significant genes from 486 to 3. The raw condition number reported for that analysis (951) was inflated by the unscaled age variable; the standardised condition number is 3. The problem in the Leng cohort is not numerical singularity but the lack of age overlap combined with the small number of donors.</w:t>
-      </w:r>
-    </w:p>
-    <w:bookmarkEnd w:id="34"/>
-    <w:bookmarkStart w:id="35" w:name="X2162210b22bc55ea5609849fd12b1bc8d4b868a"/>
+        <w:rPr>
+          <w:bCs/>
+          <w:b/>
+        </w:rPr>
+        <w:t xml:space="preserve">Table 6.</w:t>
+      </w:r>
+      <w:r>
+        <w:t xml:space="preserve"> </w:t>
+      </w:r>
+      <w:r>
+        <w:t xml:space="preserve">DD signal under donor modelling and age adjustment (Braak II versus Braak 0 fixed).</w:t>
+      </w:r>
+    </w:p>
+    <w:tbl>
+      <w:tblPr>
+        <w:tblStyle w:val="Table"/>
+        <w:tblW w:type="pct" w:w="5000"/>
+        <w:tblLook w:firstRow="1" w:lastRow="0" w:firstColumn="0" w:lastColumn="0" w:noHBand="0" w:noVBand="0" w:val="0020"/>
+        <w:jc w:val="start"/>
+        <w:tblBorders>
+          <w:top w:val="single" w:sz="4" w:color="808080"/>
+          <w:left w:val="single" w:sz="4" w:color="808080"/>
+          <w:bottom w:val="single" w:sz="4" w:color="808080"/>
+          <w:right w:val="single" w:sz="4" w:color="808080"/>
+          <w:insideH w:val="single" w:sz="4" w:color="808080"/>
+          <w:insideV w:val="single" w:sz="4" w:color="808080"/>
+        </w:tblBorders>
+      </w:tblPr>
+      <w:tblGrid>
+        <w:gridCol w:w="1584"/>
+        <w:gridCol w:w="1584"/>
+        <w:gridCol w:w="1584"/>
+        <w:gridCol w:w="1584"/>
+        <w:gridCol w:w="1584"/>
+      </w:tblGrid>
+      <w:tr>
+        <w:trPr>
+          <w:tblHeader w:val="true"/>
+        </w:trPr>
+        <w:tc>
+          <w:tcPr/>
+          <w:p>
+            <w:pPr>
+              <w:pStyle w:val="Compact"/>
+              <w:spacing w:line="240" w:lineRule="auto" w:after="0"/>
+              <w:jc w:val="left"/>
+            </w:pPr>
+            <w:r>
+              <w:rPr>
+                <w:rFonts w:ascii="Times New Roman" w:hAnsi="Times New Roman"/>
+                <w:b/>
+                <w:sz w:val="20"/>
+              </w:rPr>
+              <w:t xml:space="preserve">Model</w:t>
+            </w:r>
+          </w:p>
+        </w:tc>
+        <w:tc>
+          <w:tcPr/>
+          <w:p>
+            <w:pPr>
+              <w:pStyle w:val="Compact"/>
+              <w:spacing w:line="240" w:lineRule="auto" w:after="0"/>
+              <w:jc w:val="left"/>
+            </w:pPr>
+            <w:r>
+              <w:rPr>
+                <w:rFonts w:ascii="Times New Roman" w:hAnsi="Times New Roman"/>
+                <w:b/>
+                <w:sz w:val="20"/>
+              </w:rPr>
+              <w:t xml:space="preserve">RRHO2 DD maximum</w:t>
+            </w:r>
+          </w:p>
+        </w:tc>
+        <w:tc>
+          <w:tcPr/>
+          <w:p>
+            <w:pPr>
+              <w:pStyle w:val="Compact"/>
+              <w:spacing w:line="240" w:lineRule="auto" w:after="0"/>
+              <w:jc w:val="left"/>
+            </w:pPr>
+            <w:r>
+              <w:rPr>
+                <w:rFonts w:ascii="Times New Roman" w:hAnsi="Times New Roman"/>
+                <w:b/>
+                <w:sz w:val="20"/>
+              </w:rPr>
+              <w:t xml:space="preserve">RRHO2 DU maximum</w:t>
+            </w:r>
+          </w:p>
+        </w:tc>
+        <w:tc>
+          <w:tcPr/>
+          <w:p>
+            <w:pPr>
+              <w:pStyle w:val="Compact"/>
+              <w:spacing w:line="240" w:lineRule="auto" w:after="0"/>
+              <w:jc w:val="left"/>
+            </w:pPr>
+            <w:r>
+              <w:rPr>
+                <w:rFonts w:ascii="Times New Roman" w:hAnsi="Times New Roman"/>
+                <w:b/>
+                <w:sz w:val="20"/>
+              </w:rPr>
+              <w:t xml:space="preserve">Top-200 DD overlap (expected 10.4)</w:t>
+            </w:r>
+          </w:p>
+        </w:tc>
+        <w:tc>
+          <w:tcPr/>
+          <w:p>
+            <w:pPr>
+              <w:pStyle w:val="Compact"/>
+              <w:spacing w:line="240" w:lineRule="auto" w:after="0"/>
+              <w:jc w:val="left"/>
+            </w:pPr>
+            <w:r>
+              <w:rPr>
+                <w:rFonts w:ascii="Times New Roman" w:hAnsi="Times New Roman"/>
+                <w:b/>
+                <w:sz w:val="20"/>
+              </w:rPr>
+              <w:t xml:space="preserve">P</w:t>
+            </w:r>
+          </w:p>
+        </w:tc>
+      </w:tr>
+      <w:tr>
+        <w:tc>
+          <w:tcPr/>
+          <w:p>
+            <w:pPr>
+              <w:pStyle w:val="Compact"/>
+              <w:spacing w:line="240" w:lineRule="auto" w:after="0"/>
+              <w:jc w:val="left"/>
+            </w:pPr>
+            <w:r>
+              <w:rPr>
+                <w:rFonts w:ascii="Times New Roman" w:hAnsi="Times New Roman"/>
+                <w:sz w:val="20"/>
+              </w:rPr>
+              <w:t xml:space="preserve">No donor, no age (original)</w:t>
+            </w:r>
+          </w:p>
+        </w:tc>
+        <w:tc>
+          <w:tcPr/>
+          <w:p>
+            <w:pPr>
+              <w:pStyle w:val="Compact"/>
+              <w:spacing w:line="240" w:lineRule="auto" w:after="0"/>
+              <w:jc w:val="left"/>
+            </w:pPr>
+            <w:r>
+              <w:rPr>
+                <w:rFonts w:ascii="Times New Roman" w:hAnsi="Times New Roman"/>
+                <w:sz w:val="20"/>
+              </w:rPr>
+              <w:t xml:space="preserve">6.54</w:t>
+            </w:r>
+          </w:p>
+        </w:tc>
+        <w:tc>
+          <w:tcPr/>
+          <w:p>
+            <w:pPr>
+              <w:pStyle w:val="Compact"/>
+              <w:spacing w:line="240" w:lineRule="auto" w:after="0"/>
+              <w:jc w:val="left"/>
+            </w:pPr>
+            <w:r>
+              <w:rPr>
+                <w:rFonts w:ascii="Times New Roman" w:hAnsi="Times New Roman"/>
+                <w:sz w:val="20"/>
+              </w:rPr>
+              <w:t xml:space="preserve">4.21</w:t>
+            </w:r>
+          </w:p>
+        </w:tc>
+        <w:tc>
+          <w:tcPr/>
+          <w:p>
+            <w:pPr>
+              <w:pStyle w:val="Compact"/>
+              <w:spacing w:line="240" w:lineRule="auto" w:after="0"/>
+              <w:jc w:val="left"/>
+            </w:pPr>
+            <w:r>
+              <w:rPr>
+                <w:rFonts w:ascii="Times New Roman" w:hAnsi="Times New Roman"/>
+                <w:sz w:val="20"/>
+              </w:rPr>
+              <w:t xml:space="preserve">20</w:t>
+            </w:r>
+          </w:p>
+        </w:tc>
+        <w:tc>
+          <w:tcPr/>
+          <w:p>
+            <w:pPr>
+              <w:pStyle w:val="Compact"/>
+              <w:spacing w:line="240" w:lineRule="auto" w:after="0"/>
+              <w:jc w:val="left"/>
+            </w:pPr>
+            <w:r>
+              <w:rPr>
+                <w:rFonts w:ascii="Times New Roman" w:hAnsi="Times New Roman"/>
+                <w:sz w:val="20"/>
+              </w:rPr>
+              <w:t xml:space="preserve">0.003</w:t>
+            </w:r>
+          </w:p>
+        </w:tc>
+      </w:tr>
+      <w:tr>
+        <w:tc>
+          <w:tcPr/>
+          <w:p>
+            <w:pPr>
+              <w:pStyle w:val="Compact"/>
+              <w:spacing w:line="240" w:lineRule="auto" w:after="0"/>
+              <w:jc w:val="left"/>
+            </w:pPr>
+            <w:r>
+              <w:rPr>
+                <w:rFonts w:ascii="Times New Roman" w:hAnsi="Times New Roman"/>
+                <w:sz w:val="20"/>
+              </w:rPr>
+              <w:t xml:space="preserve">No donor, age</w:t>
+            </w:r>
+          </w:p>
+        </w:tc>
+        <w:tc>
+          <w:tcPr/>
+          <w:p>
+            <w:pPr>
+              <w:pStyle w:val="Compact"/>
+              <w:spacing w:line="240" w:lineRule="auto" w:after="0"/>
+              <w:jc w:val="left"/>
+            </w:pPr>
+            <w:r>
+              <w:rPr>
+                <w:rFonts w:ascii="Times New Roman" w:hAnsi="Times New Roman"/>
+                <w:sz w:val="20"/>
+              </w:rPr>
+              <w:t xml:space="preserve">1.29</w:t>
+            </w:r>
+          </w:p>
+        </w:tc>
+        <w:tc>
+          <w:tcPr/>
+          <w:p>
+            <w:pPr>
+              <w:pStyle w:val="Compact"/>
+              <w:spacing w:line="240" w:lineRule="auto" w:after="0"/>
+              <w:jc w:val="left"/>
+            </w:pPr>
+            <w:r>
+              <w:rPr>
+                <w:rFonts w:ascii="Times New Roman" w:hAnsi="Times New Roman"/>
+                <w:sz w:val="20"/>
+              </w:rPr>
+              <w:t xml:space="preserve">3.75</w:t>
+            </w:r>
+          </w:p>
+        </w:tc>
+        <w:tc>
+          <w:tcPr/>
+          <w:p>
+            <w:pPr>
+              <w:pStyle w:val="Compact"/>
+              <w:spacing w:line="240" w:lineRule="auto" w:after="0"/>
+              <w:jc w:val="left"/>
+            </w:pPr>
+            <w:r>
+              <w:rPr>
+                <w:rFonts w:ascii="Times New Roman" w:hAnsi="Times New Roman"/>
+                <w:sz w:val="20"/>
+              </w:rPr>
+              <w:t xml:space="preserve">9</w:t>
+            </w:r>
+          </w:p>
+        </w:tc>
+        <w:tc>
+          <w:tcPr/>
+          <w:p>
+            <w:pPr>
+              <w:pStyle w:val="Compact"/>
+              <w:spacing w:line="240" w:lineRule="auto" w:after="0"/>
+              <w:jc w:val="left"/>
+            </w:pPr>
+            <w:r>
+              <w:rPr>
+                <w:rFonts w:ascii="Times New Roman" w:hAnsi="Times New Roman"/>
+                <w:sz w:val="20"/>
+              </w:rPr>
+              <w:t xml:space="preserve">0.721</w:t>
+            </w:r>
+          </w:p>
+        </w:tc>
+      </w:tr>
+      <w:tr>
+        <w:tc>
+          <w:tcPr/>
+          <w:p>
+            <w:pPr>
+              <w:pStyle w:val="Compact"/>
+              <w:spacing w:line="240" w:lineRule="auto" w:after="0"/>
+              <w:jc w:val="left"/>
+            </w:pPr>
+            <w:r>
+              <w:rPr>
+                <w:rFonts w:ascii="Times New Roman" w:hAnsi="Times New Roman"/>
+                <w:sz w:val="20"/>
+              </w:rPr>
+              <w:t xml:space="preserve">Donor-summed, no age</w:t>
+            </w:r>
+          </w:p>
+        </w:tc>
+        <w:tc>
+          <w:tcPr/>
+          <w:p>
+            <w:pPr>
+              <w:pStyle w:val="Compact"/>
+              <w:spacing w:line="240" w:lineRule="auto" w:after="0"/>
+              <w:jc w:val="left"/>
+            </w:pPr>
+            <w:r>
+              <w:rPr>
+                <w:rFonts w:ascii="Times New Roman" w:hAnsi="Times New Roman"/>
+                <w:sz w:val="20"/>
+              </w:rPr>
+              <w:t xml:space="preserve">7.25</w:t>
+            </w:r>
+          </w:p>
+        </w:tc>
+        <w:tc>
+          <w:tcPr/>
+          <w:p>
+            <w:pPr>
+              <w:pStyle w:val="Compact"/>
+              <w:spacing w:line="240" w:lineRule="auto" w:after="0"/>
+              <w:jc w:val="left"/>
+            </w:pPr>
+            <w:r>
+              <w:rPr>
+                <w:rFonts w:ascii="Times New Roman" w:hAnsi="Times New Roman"/>
+                <w:sz w:val="20"/>
+              </w:rPr>
+              <w:t xml:space="preserve">4.12</w:t>
+            </w:r>
+          </w:p>
+        </w:tc>
+        <w:tc>
+          <w:tcPr/>
+          <w:p>
+            <w:pPr>
+              <w:pStyle w:val="Compact"/>
+              <w:spacing w:line="240" w:lineRule="auto" w:after="0"/>
+              <w:jc w:val="left"/>
+            </w:pPr>
+            <w:r>
+              <w:rPr>
+                <w:rFonts w:ascii="Times New Roman" w:hAnsi="Times New Roman"/>
+                <w:sz w:val="20"/>
+              </w:rPr>
+              <w:t xml:space="preserve">21</w:t>
+            </w:r>
+          </w:p>
+        </w:tc>
+        <w:tc>
+          <w:tcPr/>
+          <w:p>
+            <w:pPr>
+              <w:pStyle w:val="Compact"/>
+              <w:spacing w:line="240" w:lineRule="auto" w:after="0"/>
+              <w:jc w:val="left"/>
+            </w:pPr>
+            <w:r>
+              <w:rPr>
+                <w:rFonts w:ascii="Times New Roman" w:hAnsi="Times New Roman"/>
+                <w:sz w:val="20"/>
+              </w:rPr>
+              <w:t xml:space="preserve">0.001</w:t>
+            </w:r>
+          </w:p>
+        </w:tc>
+      </w:tr>
+      <w:tr>
+        <w:tc>
+          <w:tcPr/>
+          <w:p>
+            <w:pPr>
+              <w:pStyle w:val="Compact"/>
+              <w:spacing w:line="240" w:lineRule="auto" w:after="0"/>
+              <w:jc w:val="left"/>
+            </w:pPr>
+            <w:r>
+              <w:rPr>
+                <w:rFonts w:ascii="Times New Roman" w:hAnsi="Times New Roman"/>
+                <w:sz w:val="20"/>
+              </w:rPr>
+              <w:t xml:space="preserve">Donor-summed, age (deviation analysis)</w:t>
+            </w:r>
+          </w:p>
+        </w:tc>
+        <w:tc>
+          <w:tcPr/>
+          <w:p>
+            <w:pPr>
+              <w:pStyle w:val="Compact"/>
+              <w:spacing w:line="240" w:lineRule="auto" w:after="0"/>
+              <w:jc w:val="left"/>
+            </w:pPr>
+            <w:r>
+              <w:rPr>
+                <w:rFonts w:ascii="Times New Roman" w:hAnsi="Times New Roman"/>
+                <w:sz w:val="20"/>
+              </w:rPr>
+              <w:t xml:space="preserve">1.48</w:t>
+            </w:r>
+          </w:p>
+        </w:tc>
+        <w:tc>
+          <w:tcPr/>
+          <w:p>
+            <w:pPr>
+              <w:pStyle w:val="Compact"/>
+              <w:spacing w:line="240" w:lineRule="auto" w:after="0"/>
+              <w:jc w:val="left"/>
+            </w:pPr>
+            <w:r>
+              <w:rPr>
+                <w:rFonts w:ascii="Times New Roman" w:hAnsi="Times New Roman"/>
+                <w:sz w:val="20"/>
+              </w:rPr>
+              <w:t xml:space="preserve">3.37</w:t>
+            </w:r>
+          </w:p>
+        </w:tc>
+        <w:tc>
+          <w:tcPr/>
+          <w:p>
+            <w:pPr>
+              <w:pStyle w:val="Compact"/>
+              <w:spacing w:line="240" w:lineRule="auto" w:after="0"/>
+              <w:jc w:val="left"/>
+            </w:pPr>
+            <w:r>
+              <w:rPr>
+                <w:rFonts w:ascii="Times New Roman" w:hAnsi="Times New Roman"/>
+                <w:sz w:val="20"/>
+              </w:rPr>
+              <w:t xml:space="preserve">8</w:t>
+            </w:r>
+          </w:p>
+        </w:tc>
+        <w:tc>
+          <w:tcPr/>
+          <w:p>
+            <w:pPr>
+              <w:pStyle w:val="Compact"/>
+              <w:spacing w:line="240" w:lineRule="auto" w:after="0"/>
+              <w:jc w:val="left"/>
+            </w:pPr>
+            <w:r>
+              <w:rPr>
+                <w:rFonts w:ascii="Times New Roman" w:hAnsi="Times New Roman"/>
+                <w:sz w:val="20"/>
+              </w:rPr>
+              <w:t xml:space="preserve">0.826</w:t>
+            </w:r>
+          </w:p>
+        </w:tc>
+      </w:tr>
+    </w:tbl>
+    <w:p>
+      <w:pPr>
+        <w:pStyle w:val="BodyText"/>
+      </w:pPr>
+      <w:r>
+        <w:t xml:space="preserve">This does not mean the DD signal is an ageing effect. In the Leng cohort the age ranges of the Braak II and Braak 0 groups do not overlap (Braak 0: 50–71; Braak II: 72–91; r = 0.80; VIF = 2.74), so any term for age also absorbs much of the Braak contrast. The honest reading is narrower: the DD signal cannot be identified as a disease-stage effect in this cohort. The plan-conformant Braak VI ranking, which includes age, correlated with the original ranking at a Spearman r of only 0.584 (Figure 5D shows the DD maxima).</w:t>
+      </w:r>
+    </w:p>
+    <w:p>
+      <w:pPr>
+        <w:pStyle w:val="BodyText"/>
+      </w:pPr>
+      <w:r>
+        <w:t xml:space="preserve">Pseudoreplication matters for a different reason. It inflated the number of significant genes from 0–27 to 486, and as recorded in the register, adding age to the pseudoreplicated design brought that number down to 3. The raw condition number reported for that model (951) was inflated by the unscaled age variable; the standardised condition number is 3. The problem in the Leng cohort is not numerical singularity but the lack of age overlap combined with the small number of donors.</w:t>
+      </w:r>
+    </w:p>
+    <w:bookmarkEnd w:id="35"/>
+    <w:bookmarkStart w:id="36" w:name="X2162210b22bc55ea5609849fd12b1bc8d4b868a"/>
     <w:p>
       <w:pPr>
         <w:pStyle w:val="Heading3"/>
       </w:pPr>
       <w:r>
-        <w:t xml:space="preserve">3.5 Exploratory: stress genes rise independently of composition in an independent AD cohort</w:t>
+        <w:t xml:space="preserve">3.6 Exploratory: stress genes rise independently of composition in an independent AD cohort</w:t>
       </w:r>
     </w:p>
     <w:p>
@@ -4440,12 +5106,12 @@
         <w:pStyle w:val="BodyText"/>
       </w:pPr>
       <w:r>
-        <w:t xml:space="preserve">Two points matter for interpreting this. First, in the original Leng analysis these six genes were lower in vulnerable neurons; their rise in bulk tissue runs the other way and cannot be read as a directional convergence. Second, the DD quadrant from which the genes were chosen does not survive analytic correction, as Section 3.4 shows. The finding is therefore a descriptive observation of a composition-independent rise in stress genes in advanced AD tissue, not evidence for a shared AD-GBM axis. Bulk data cannot tell us which cell type drives the increase.</w:t>
-      </w:r>
-    </w:p>
-    <w:bookmarkEnd w:id="35"/>
+        <w:t xml:space="preserve">Two points matter for interpreting this. First, in the original Leng analysis these six genes were lower in vulnerable neurons; their rise in bulk tissue runs the other way and cannot be read as a directional convergence. Second, the DD quadrant from which the genes were chosen does not survive adjustment for age, as Section 3.5 shows. The finding is therefore a descriptive observation of a composition-independent rise in stress genes in advanced AD tissue, not evidence for a shared AD-GBM axis. Bulk data cannot tell us which cell type drives the increase.</w:t>
+      </w:r>
+    </w:p>
     <w:bookmarkEnd w:id="36"/>
-    <w:bookmarkStart w:id="44" w:name="discussion"/>
+    <w:bookmarkEnd w:id="37"/>
+    <w:bookmarkStart w:id="45" w:name="discussion"/>
     <w:p>
       <w:pPr>
         <w:pStyle w:val="Heading2"/>
@@ -4454,7 +5120,7 @@
         <w:t xml:space="preserve">4. Discussion</w:t>
       </w:r>
     </w:p>
-    <w:bookmarkStart w:id="37" w:name="principal-findings"/>
+    <w:bookmarkStart w:id="38" w:name="principal-findings"/>
     <w:p>
       <w:pPr>
         <w:pStyle w:val="Heading3"/>
@@ -4476,11 +5142,11 @@
         <w:pStyle w:val="BodyText"/>
       </w:pPr>
       <w:r>
-        <w:t xml:space="preserve">The two results do not carry the same weight. The H1 result is consistent across two independent methods, all pre-specified sensitivity analyses and a negative control that rules out loss of statistical power. The rejection of H2 has to be read alongside the limited power of the discovery cohort, which I discuss in Section 4.3.</w:t>
-      </w:r>
-    </w:p>
-    <w:bookmarkEnd w:id="37"/>
-    <w:bookmarkStart w:id="38" w:name="X3aa0dd0a4337ae42c4e435850bfa764482c8740"/>
+        <w:t xml:space="preserve">The two results do not carry the same weight. The H1 result holds across all pre-specified sensitivity analyses, survives a negative control that rules out loss of statistical power, and replicates in an independent AD cohort. Of the two deconvolution methods, only BRETIGEA gave plausible composition estimates, so the weight of the evidence rests on it and on the replication, not on MuSiC. The rejection of H2 has to be read alongside the limited power of the discovery cohort, which I discuss in Section 4.3.</w:t>
+      </w:r>
+    </w:p>
+    <w:bookmarkEnd w:id="38"/>
+    <w:bookmarkStart w:id="39" w:name="X3aa0dd0a4337ae42c4e435850bfa764482c8740"/>
     <w:p>
       <w:pPr>
         <w:pStyle w:val="Heading3"/>
@@ -4513,8 +5179,8 @@
         <w:t xml:space="preserve">This study did not, however, test the specific genes or pathways reported in earlier work. Those studies had different designs, and some included single-cell data or functional experiments [5, 6]. My findings do not invalidate their conclusions. What they do show is that convergence claims resting on the number of shared bulk DEGs are weak evidence unless composition has been controlled.</w:t>
       </w:r>
     </w:p>
-    <w:bookmarkEnd w:id="38"/>
-    <w:bookmarkStart w:id="39" w:name="X67f0d94e3738bf970b2c4d52fc1d9ef174afb14"/>
+    <w:bookmarkEnd w:id="39"/>
+    <w:bookmarkStart w:id="40" w:name="X67f0d94e3738bf970b2c4d52fc1d9ef174afb14"/>
     <w:p>
       <w:pPr>
         <w:pStyle w:val="Heading3"/>
@@ -4569,8 +5235,8 @@
         <w:t xml:space="preserve">. The plan anticipated this possibility and asked whether the earlier bulk signal had a counterpart at the level of cell types. The answer here is that any such counterpart is too weak to be demonstrated with this cohort. Single-nucleus atlases with more donors would allow a stronger test.</w:t>
       </w:r>
     </w:p>
-    <w:bookmarkEnd w:id="39"/>
-    <w:bookmarkStart w:id="40" w:name="Xc239ada5b05346f465992cce3fdd367b9787de6"/>
+    <w:bookmarkEnd w:id="40"/>
+    <w:bookmarkStart w:id="41" w:name="Xc239ada5b05346f465992cce3fdd367b9787de6"/>
     <w:p>
       <w:pPr>
         <w:pStyle w:val="Heading3"/>
@@ -4584,7 +5250,7 @@
         <w:pStyle w:val="FirstParagraph"/>
       </w:pPr>
       <w:r>
-        <w:t xml:space="preserve">Perhaps the most general contribution of this work is that the origin of the</w:t>
+        <w:t xml:space="preserve">Perhaps the most general contribution of this work is that the</w:t>
       </w:r>
       <w:r>
         <w:t xml:space="preserve"> </w:t>
@@ -4602,7 +5268,7 @@
         <w:t xml:space="preserve"> </w:t>
       </w:r>
       <w:r>
-        <w:t xml:space="preserve">(DD) signal seen in the original analysis could be traced. The original Stage 1 code treated three subcluster profiles from the same donor as independent samples and left out the age covariate required by the plan. Ignoring the correlation between observations from the same donor (0.35) gave 486 significant genes; modelling donor properly reduced this to 27 or to zero. It has been shown before that treating cells or subclusters as independent in between-donor comparisons of single-cell data inflates the false-positive rate considerably, and that donor-level pseudobulk methods are among those that control this error best [14, 31, 40]. My observation agrees with that literature, and it adds that the same error can also distort convergence tests that depend on gene rankings, not only the count of significant genes.</w:t>
+        <w:t xml:space="preserve">(DD) signal of the original analysis could be traced back to specific analytic choices. The original Stage 1 code made two of them. It treated three subcluster profiles from the same donor as independent samples, and it left out the age covariate required by the plan. The two errors did different things.</w:t>
       </w:r>
     </w:p>
     <w:p>
@@ -4610,7 +5276,7 @@
         <w:pStyle w:val="BodyText"/>
       </w:pPr>
       <w:r>
-        <w:t xml:space="preserve">The second factor is the age structure of the discovery cohort. The age ranges of the Braak 0 and Braak II groups do not overlap (50–71 and 72–91). Under those conditions, separating the effect of age from the effect of Braak stage requires linear extrapolation into an age range that was never observed. When the Braak II contrast was kept but donor-level inference and age were added, the original DD signal on the RRHO2 map fell from 6.54 to 1.48. The direction of the effect estimates, on the other hand, was largely preserved (log2FC correlation 0.981). The error did not create effects out of nothing. It changed the statistical certainty attached to them, and with it the composition of the extreme gene sets.</w:t>
+        <w:t xml:space="preserve">Treating correlated observations as independent (within-donor correlation 0.35) inflated the number of significant genes to 486; donor-level models gave 0 to 27. Between-donor comparisons in single-cell data are known to produce many false positives when cells or subclusters are treated as independent, and donor-level pseudobulk methods are among those that control this best [14, 31, 40]. My data fit that literature. But when I separated the two corrections, modelling donor did not remove the DD signal. Adding age did. I had first written that pseudoreplication and the missing age term together produced the signal; the 2 × 2 decomposition, prompted by an external review, showed that this was wrong, and I have corrected it.</w:t>
       </w:r>
     </w:p>
     <w:p>
@@ -4618,11 +5284,19 @@
         <w:pStyle w:val="BodyText"/>
       </w:pPr>
       <w:r>
-        <w:t xml:space="preserve">The pre-specified plan is what made these errors visible. Analysis decisions taken after seeing the data raise the false-positive rate [12], and preregistration lowers that risk by separating hypothesis generation from hypothesis testing [13]. Here the plan did three concrete things. Its definitions of donor-level pseudobulk and of age as a covariate made it possible to see where the implementation had strayed. Its fixed H2 thresholds (for example, an odds ratio of at least 3) stopped the DU quadrant, which strengthened in the corrected analysis, from being presented after the fact as a finding. And its rule against reformulating hypotheses kept the exploratory DD signal from becoming the main claim of the paper. The experience also taught me that a plan works only if the implementation is checked against it regularly. The audit and the re-analyses were run in an order in which every decision was committed before its results were produced.</w:t>
-      </w:r>
-    </w:p>
-    <w:bookmarkEnd w:id="40"/>
-    <w:bookmarkStart w:id="41" w:name="Xa3984f58f9e93122e713ee91649f291fb57b22a"/>
+        <w:t xml:space="preserve">Age matters here because of how the cohort was built. The Braak 0 and Braak II donors do not overlap in age (50–71 and 72–91), so an age term cannot be estimated separately from the disease contrast without extrapolating into an age range that was never observed. Adding it removes the DD signal, but that does not show the signal was caused by ageing. It shows only that, in this cohort, the signal cannot be attributed to Braak stage.</w:t>
+      </w:r>
+    </w:p>
+    <w:p>
+      <w:pPr>
+        <w:pStyle w:val="BodyText"/>
+      </w:pPr>
+      <w:r>
+        <w:t xml:space="preserve">The pre-specified plan is what made these errors visible. Analysis decisions taken after seeing the data raise the false-positive rate [12], and preregistration lowers that risk by separating hypothesis generation from hypothesis testing [13]. Here the plan did three concrete things. Its definitions of donor-level pseudobulk and of age as a covariate made it possible to see where the implementation had strayed. Its fixed H2 thresholds (for example, an odds ratio of at least 3) stopped the DU quadrant, which strengthened in the corrected analysis, from being presented after the fact as a finding. And its rule against reformulating hypotheses kept the exploratory DD signal from becoming the main claim of the paper. The experience also taught me that a plan works only if the implementation is checked against it regularly, and that outside readers catch things the author does not: the replication and the decomposition in this paper came from an external review. The audit and the re-analyses were run in an order in which every decision was committed before its results were produced.</w:t>
+      </w:r>
+    </w:p>
+    <w:bookmarkEnd w:id="41"/>
+    <w:bookmarkStart w:id="42" w:name="Xa3984f58f9e93122e713ee91649f291fb57b22a"/>
     <w:p>
       <w:pPr>
         <w:pStyle w:val="Heading3"/>
@@ -4639,8 +5313,8 @@
         <w:t xml:space="preserve">Six stress genes taken from the original DD quadrant were higher in advanced AD in an independent cohort, even after adjustment for age, sex and marker-based composition. There are three reasons to be cautious about this. First, the DD signal that led to these genes being chosen does not survive analytic correction. Second, their rise in bulk tissue is the opposite of the decrease seen in vulnerable neurons in the discovery cohort, so it cannot be read as a directional convergence. Third, gene expression profiles of post-mortem brain can be strongly affected by agonal conditions before death [41]. Immediate-early genes, the family to which JUNB belongs, can also be induced ex vivo during tissue dissociation in single-cell studies [42], and a similar artefactual signal, most prominent in microglia, has been found in post-mortem human single-nucleus data [43]. With bulk data it is not possible to tell whether the increase reflects the molecular remodelling of reactive astrocytes [44] or technical and agonal factors of this kind. The observation is best treated as descriptive, with its cellular source still to be established with single-cell data, and not as evidence for a shared AD-GBM axis.</w:t>
       </w:r>
     </w:p>
-    <w:bookmarkEnd w:id="41"/>
-    <w:bookmarkStart w:id="42" w:name="limitations"/>
+    <w:bookmarkEnd w:id="42"/>
+    <w:bookmarkStart w:id="43" w:name="limitations"/>
     <w:p>
       <w:pPr>
         <w:pStyle w:val="Heading3"/>
@@ -4662,7 +5336,7 @@
         <w:pStyle w:val="BodyText"/>
       </w:pPr>
       <w:r>
-        <w:t xml:space="preserve">The deconvolution methods have their own weaknesses. The MuSiC proportions are not biologically plausible in either cohort (for example, fewer than 1% neurons in control tissue). There are several possible reasons. The reference is a single-nucleus dataset [21], and a matched comparison in mouse visual cortex found that the nuclear share of total cellular mRNA ranges from about 20% to over 50% depending on the size of the pyramidal neuron [45], which could create a systematic mismatch between a nuclear reference and whole-cell RNA from bulk tissue. The reference is also enriched for neurons, and its glial profiles come from few nuclei. Deconvolution works better on a linear scale, and cell types present in the mixture but missing from the reference degrade results substantially [46]. For MuSiC, the main weaknesses here are the scale conversion of microarray data in the AD cohort and the absence of a malignant cell type from the reference for GBM tissue. The accuracy of brain deconvolution also depends strongly on factors such as brain region and the properties of the cell-type signatures used [47]. The marker-based BRETIGEA method [37] runs into a different problem in tumour tissue: astrocyte-like malignant cells express astrocyte markers [10], so in tumours the astrocyte score partly mixes normal astrocytes with malignant states. GBM tissue also contains variable proportions of immune cells such as macrophages and microglia [48]. The composition adjustment on the GBM side of H1 should therefore be seen as approximate.</w:t>
+        <w:t xml:space="preserve">The deconvolution methods have their own weaknesses. The MuSiC proportions are not biologically plausible in either cohort (for example, fewer than 1% neurons in control tissue), which is why I do not treat Model C as independent confirmation. There are several possible reasons. The reference is a single-nucleus dataset [21], and a matched comparison in mouse visual cortex found that the nuclear share of total cellular mRNA ranges from about 20% to over 50% depending on the size of the pyramidal neuron [45], which could create a systematic mismatch between a nuclear reference and whole-cell RNA from bulk tissue. The reference is also enriched for neurons, and its glial profiles come from few nuclei. Deconvolution works better on a linear scale, and cell types present in the mixture but missing from the reference degrade results substantially [46]. For MuSiC, the main weaknesses here are the scale conversion of microarray data in the AD cohort and the absence of a malignant cell type from the reference for GBM tissue. The accuracy of brain deconvolution also depends strongly on factors such as brain region and the properties of the cell-type signatures used [47]. The marker-based BRETIGEA method [37] runs into a different problem in tumour tissue: astrocyte-like malignant cells express astrocyte markers [10], so in tumours the astrocyte score partly mixes normal astrocytes with malignant states. GBM tissue also contains variable proportions of immune cells such as macrophages and microglia [48]. The composition adjustment on the GBM side of H1 should therefore be seen as approximate.</w:t>
       </w:r>
     </w:p>
     <w:p>
@@ -4678,11 +5352,11 @@
         <w:pStyle w:val="BodyText"/>
       </w:pPr>
       <w:r>
-        <w:t xml:space="preserve">The AD meta-cohort is small (n = 51) and relies on merging two microarray platforms with ComBat; preserving diagnosis as a covariate can inflate significance in later tests when groups are unevenly spread across datasets [36]. The plan’s exclusion criteria for RNA quality and manner of death could not be applied to the GTEx samples. The Neftel data are publicly available only as TPM values, which are not ideal for negative binomial models. Finally, although the analysis plan was committed to a local git repository before any data were analysed, the public upload that the plan promised did not happen before the analysis. The timestamps were generated by the author and cannot be verified independently, so the study rests on a time-stamped, pre-specified plan and not on a formal preregistration. Every point where the implementation departed from the plan is recorded in the deviation register, together with the date on which it was found.</w:t>
-      </w:r>
-    </w:p>
-    <w:bookmarkEnd w:id="42"/>
-    <w:bookmarkStart w:id="43" w:name="conclusion"/>
+        <w:t xml:space="preserve">The AD meta-cohort is small (n = 51) and relies on merging two microarray platforms with ComBat. The complete loss of AD DEGs in this cohort did not recur in the larger GSE125583 cohort, where about half survived adjustment, so the size of the effect in the meta-cohort should not be generalised; preserving diagnosis as a covariate can inflate significance in later tests when groups are unevenly spread across datasets [36]. The plan’s exclusion criteria for RNA quality and manner of death could not be applied to the GTEx samples. The Neftel data are publicly available only as TPM values, which are not ideal for negative binomial models; a limma-trend analysis on log-scaled TPM gave the same H2 decision. Finally, although the analysis plan was committed to a local git repository before any data were analysed, the public upload that the plan promised did not happen before the analysis. The timestamps were generated by the author and cannot be verified independently, so the study rests on a time-stamped, pre-specified plan and not on a formal preregistration. Every point where the implementation departed from the plan is recorded in the deviation register, together with the date on which it was found.</w:t>
+      </w:r>
+    </w:p>
+    <w:bookmarkEnd w:id="43"/>
+    <w:bookmarkStart w:id="44" w:name="conclusion"/>
     <w:p>
       <w:pPr>
         <w:pStyle w:val="Heading3"/>
@@ -4696,12 +5370,12 @@
         <w:pStyle w:val="FirstParagraph"/>
       </w:pPr>
       <w:r>
-        <w:t xml:space="preserve">In this study, the transcriptomic convergence between AD and GBM seen in bulk tissue disappeared once cell composition was controlled, and no detectable overlap could be shown between the identity of vulnerable neurons and the neural-mimicry states of the tumour at cell-type resolution. A convergence-like signal in the discovery analysis turned out to come from pseudoreplication combined with confounding by age. Claims of shared biology from cross-disease transcriptomic comparisons are only as reliable as the composition control, donor-level inference and pre-specified analysis behind them.</w:t>
-      </w:r>
-    </w:p>
-    <w:bookmarkEnd w:id="43"/>
+        <w:t xml:space="preserve">In two AD cohorts, the transcriptomic signature shared by AD and GBM in bulk tissue did not survive adjustment for estimated cell composition, and the shared genes were lost far more often than disease-associated genes in general. At cell-type resolution, no overlap between vulnerable-neuron identity and the neural-mimicry states of the tumour could be detected with the donors available. A convergence-like signal in the discovery analysis disappeared once age was modelled, while pseudoreplication separately inflated the number of significant genes. Claims of shared biology from cross-disease transcriptomic comparisons are only as reliable as the composition control, donor-level inference and pre-specified analysis behind them.</w:t>
+      </w:r>
+    </w:p>
     <w:bookmarkEnd w:id="44"/>
-    <w:bookmarkStart w:id="45" w:name="data-and-code-availability"/>
+    <w:bookmarkEnd w:id="45"/>
+    <w:bookmarkStart w:id="46" w:name="data-and-code-availability"/>
     <w:p>
       <w:pPr>
         <w:pStyle w:val="Heading2"/>
@@ -4728,8 +5402,8 @@
         <w:t>.</w:t>
       </w:r>
     </w:p>
-    <w:bookmarkEnd w:id="45"/>
-    <w:bookmarkStart w:id="46" w:name="funding"/>
+    <w:bookmarkEnd w:id="46"/>
+    <w:bookmarkStart w:id="47" w:name="funding"/>
     <w:p>
       <w:pPr>
         <w:pStyle w:val="Heading2"/>
@@ -4750,8 +5424,8 @@
         <w:t>[CHECK: funding statement]</w:t>
       </w:r>
     </w:p>
-    <w:bookmarkEnd w:id="46"/>
-    <w:bookmarkStart w:id="47" w:name="competing-interests"/>
+    <w:bookmarkEnd w:id="47"/>
+    <w:bookmarkStart w:id="48" w:name="competing-interests"/>
     <w:p>
       <w:pPr>
         <w:pStyle w:val="Heading2"/>
@@ -4772,8 +5446,8 @@
         <w:t>[CHECK: competing interests statement]</w:t>
       </w:r>
     </w:p>
-    <w:bookmarkEnd w:id="47"/>
-    <w:bookmarkStart w:id="48" w:name="references"/>
+    <w:bookmarkEnd w:id="48"/>
+    <w:bookmarkStart w:id="49" w:name="references"/>
     <w:p>
       <w:pPr>
         <w:pStyle w:val="Heading2"/>
@@ -5364,8 +6038,8 @@
         <w:t xml:space="preserve">Wang Q, Hu B, Hu X, et al. Tumor evolution of glioma-intrinsic gene expression subtypes associates with immunological changes in the microenvironment. Cancer Cell. 2017;32(1):42-56.e6. doi:10.1016/j.ccell.2017.06.003</w:t>
       </w:r>
     </w:p>
-    <w:bookmarkEnd w:id="48"/>
-    <w:bookmarkStart w:id="49" w:name="figure-legends"/>
+    <w:bookmarkEnd w:id="49"/>
+    <w:bookmarkStart w:id="50" w:name="figure-legends"/>
     <w:p>
       <w:pPr>
         <w:pStyle w:val="Heading2"/>
@@ -5461,11 +6135,11 @@
         <w:t xml:space="preserve"> </w:t>
       </w:r>
       <w:r>
-        <w:t xml:space="preserve">Exploratory: sensitivity of the original DD signal to analytic corrections. (A) Genes at FDR &lt; 0.05 in the original pseudoreplicated analysis, with a donor block (limma-voom) and with donor-summed counts (edgeR). (B) log2FC in the original versus the donor-summed analysis; orange points are the 20 genes of the original DD quadrant. (C) Threshold profile of the four-quadrant overlap test for the DD and DU quadrants with the original and donor-level rankings; the dotted line marks BH-adjusted P = 0.05. (D) Highest −log10(P) in the RRHO2 DD quadrant for the three analyses; the dashed line marks adjusted P = 0.001.</w:t>
-      </w:r>
-    </w:p>
-    <w:bookmarkEnd w:id="49"/>
+        <w:t xml:space="preserve">Exploratory: sensitivity of the original DD signal to analytic corrections. (A) Genes at FDR &lt; 0.05 in the original pseudoreplicated analysis, with a donor block (limma-voom) and with donor-summed counts (edgeR). (B) log2FC in the original versus the donor-summed analysis; orange points are the 20 genes of the original DD quadrant. (C) Threshold profile of the four-quadrant overlap test for the DD and DU quadrants with the original ranking and a donor-block (limma-voom) ranking; the dotted line marks BH-adjusted P = 0.05. (D) Highest −log10(P) in the RRHO2 DD quadrant for the original analysis, the deviation analysis (donor-summed, age-adjusted) and the plan analysis; the dashed line marks adjusted P = 0.001. The full donor × age decomposition is given in Table 6.</w:t>
+      </w:r>
+    </w:p>
     <w:bookmarkEnd w:id="50"/>
+    <w:bookmarkEnd w:id="51"/>
     <w:sectPr>
       <w:footerReference w:type="default" r:id="rId9"/>
       <w:pgSz w:w="11906" w:h="16838"/>

</xml_diff>

<commit_message>
Manuscript v3 (EN): calibrated wording for replication, 24% expectation removed, MuSiC role explicit, DEG count difference explained, Table 6 P values defined
</commit_message>
<xml_diff>
--- a/manuscript/drafts/manuscript_scenarioB_EN.docx
+++ b/manuscript/drafts/manuscript_scenarioB_EN.docx
@@ -72,7 +72,7 @@
         <w:t xml:space="preserve"> </w:t>
       </w:r>
       <w:r>
-        <w:t xml:space="preserve">Alzheimer’s disease (AD) and cancer are inversely associated, which has motivated searches for transcriptomic signatures shared by AD and glioblastoma (GBM). Both diseases reshape the cellular make-up of brain tissue, so genes that change together in bulk samples may simply track cell composition.</w:t>
+        <w:t xml:space="preserve">The inverse association between Alzheimer’s disease (AD) and cancer has motivated searches for transcriptomic signatures shared by AD and glioblastoma (GBM). Both diseases reshape brain tissue composition, so genes that change together in bulk samples may simply track cell composition.</w:t>
       </w:r>
     </w:p>
     <w:p>
@@ -90,7 +90,7 @@
         <w:t xml:space="preserve"> </w:t>
       </w:r>
       <w:r>
-        <w:t xml:space="preserve">Hypotheses, thresholds and decision rules were fixed in a time-stamped plan before analysis. For the primary hypothesis (H1), I compared shared differentially expressed genes (DEGs) between a hippocampal AD meta-cohort (n = 51) and TCGA-GBM/GTEx (152 tumours, 186 controls), with and without composition covariates from BRETIGEA and MuSiC, and repeated the test in an independent AD cohort (n = 195). For the secondary hypothesis (H2), I tested whether a donor-level signature of vulnerable RORB+ entorhinal neurons overlaps with GBM neural-like malignant states, using three pre-specified tests. Every deviation from the plan was recorded.</w:t>
+        <w:t xml:space="preserve">Hypotheses, thresholds and decision rules were fixed in a time-stamped plan before analysis. For the primary hypothesis (H1), I compared shared differentially expressed genes (DEGs) between a hippocampal AD meta-cohort (n = 51) and TCGA-GBM/GTEx (n = 338), with and without composition covariates from two pre-specified deconvolution methods, and repeated the test with BRETIGEA in an independent AD cohort (n = 195). For the secondary hypothesis (H2), I tested whether vulnerable RORB+ entorhinal neurons and GBM neural-like malignant states share a signature, using three pre-specified tests. Every deviation from the plan was recorded.</w:t>
       </w:r>
     </w:p>
     <w:p>
@@ -108,7 +108,7 @@
         <w:t xml:space="preserve"> </w:t>
       </w:r>
       <w:r>
-        <w:t xml:space="preserve">The 1,458 shared DEGs fell to zero with either adjustment, so H1 was supported; noise covariates did not reproduce this loss. In the independent cohort, adjustment kept 46% of AD DEGs but removed 93% of shared DEGs. With three donors per group, H2 failed all three tests in every analysis. A convergence-like signal in the original implementation disappeared when age was modelled but not when donor was modelled; pseudoreplication separately inflated significant genes (486, against 0–27 at donor level).</w:t>
+        <w:t xml:space="preserve">The 1,458 shared DEGs fell to zero with BRETIGEA adjustment, so H1 was supported; MuSiC gave the same count but implausible proportions, and noise covariates did not reproduce the loss. In the independent cohort, BRETIGEA adjustment kept 46% of AD DEGs but only 7% of shared DEGs (3,912 to 288). With three donors per group, H2 failed all three tests in every analysis. A convergence-like signal in the original implementation disappeared when age was modelled but not when donor was modelled; pseudoreplication separately inflated significant genes (486 versus 0–27).</w:t>
       </w:r>
     </w:p>
     <w:p>
@@ -126,7 +126,7 @@
         <w:t xml:space="preserve"> </w:t>
       </w:r>
       <w:r>
-        <w:t xml:space="preserve">Shared bulk signatures of AD and GBM did not survive adjustment for estimated cell composition, and no cell-type-level convergence was detectable with the donors available. Cross-disease comparisons need composition adjustment, donor-level inference and attention to confounding by age.</w:t>
+        <w:t xml:space="preserve">In two AD cohorts, most of the bulk signature shared by AD and GBM was lost after adjustment for estimated cell composition, and no cell-type-level convergence was detectable with the donors available. Cross-disease comparisons need composition adjustment, donor-level inference and attention to confounding by age.</w:t>
       </w:r>
     </w:p>
     <w:p>
@@ -1210,7 +1210,7 @@
         <w:t xml:space="preserve">Est.prop.weighted</w:t>
       </w:r>
       <w:r>
-        <w:t xml:space="preserve">) was used. Because the proportions sum to one, the endothelial proportion was left out of the model to avoid exact collinearity.</w:t>
+        <w:t xml:space="preserve">) was used. Because the proportions sum to one, the endothelial proportion was left out of the model to avoid exact collinearity. MuSiC is retained because the plan specified it, but its results are interpreted in the light of how plausible its estimates are (Section 3.1).</w:t>
       </w:r>
     </w:p>
     <w:p>
@@ -1445,7 +1445,7 @@
         <w:t xml:space="preserve"> </w:t>
       </w:r>
       <w:r>
-        <w:t xml:space="preserve">and Model B adding the six BRETIGEA scores, fitted with limma-trend; the GBM models were left unchanged. The shared-DEG ratio B/A was labelled as replicating H1 if at most 0.20, not replicating if at least 0.50, and partial otherwise. MuSiC was not run, for the reasons given in Section 3.1. (ii) A 2 × 2 decomposition of the original DD signal: with the Braak II versus Braak 0 contrast held fixed, the RRHO2 DD and DU maxima and the top-200 DD overlap were computed with and without donor modelling (donor-summed edgeR) and with and without age. All four cells are reported, without a decision rule. (iii) A GBM sensitivity analysis: the Neftel pseudobulk profiles were scaled to one million per sample, transformed as log2(x + 1) and fitted with limma-trend (</w:t>
+        <w:t xml:space="preserve">and Model B adding the six BRETIGEA scores, fitted with limma-trend; the GBM models were left unchanged. This analysis used the gene-symbol-level matrix and the six BRETIGEA scores, whereas the stress-gene analysis above used the Ensembl-level matrix and three marker scores, so their genome-wide DEG counts differ slightly. The shared-DEG ratio B/A was labelled as replicating H1 if at most 0.20, not replicating if at least 0.50, and partial otherwise. MuSiC was not run, for the reasons given in Section 3.1. (ii) A 2 × 2 decomposition of the original DD signal: with the Braak II versus Braak 0 contrast held fixed, the RRHO2 DD and DU maxima and the top-200 DD overlap were computed with and without donor modelling (donor-summed edgeR) and with and without age. All four cells are reported, without a decision rule. (iii) A GBM sensitivity analysis: the Neftel pseudobulk profiles were scaled to one million per sample, transformed as log2(x + 1) and fitted with limma-trend (</w:t>
       </w:r>
       <w:r>
         <w:rPr>
@@ -4016,7 +4016,7 @@
         <w:pStyle w:val="BodyText"/>
       </w:pPr>
       <w:r>
-        <w:t xml:space="preserve">Two things stand out. In this larger RNA-seq cohort, composition adjustment did not wipe out the disease signal: almost half of the AD DEGs survived. The complete loss seen in the 51-sample meta-cohort was therefore probably a feature of that small, ComBat-merged cohort. The shared genes, on the other hand, were lost far more often than DEGs in general. If they were a random subset, one would expect roughly a quarter of them to survive (0.456 in AD × 0.526 in GBM ≈ 0.24); in fact 7.4% did. This comparison was not pre-declared, but it suggests that the genes shared by AD and GBM lean on the composition axis much more heavily than the AD signal as a whole.</w:t>
+        <w:t xml:space="preserve">Two things stand out. In this larger RNA-seq cohort, composition adjustment did not wipe out the disease signal: almost half of the AD DEGs survived. The complete loss seen in the 51-sample meta-cohort was therefore probably a feature of that small, ComBat-merged cohort. The shared genes, on the other hand, fared much worse than DEGs in either cohort: 7.4% of them survived adjustment, against 45.6% of AD DEGs and 52.6% of GBM DEGs. Shared DEGs are a selected set, defined by being significant in both cohorts, so these retention figures cannot be combined into an expected value, and this comparison is descriptive, not a test. A formal assessment would need a null built from gene sets matched for expression level and initial effect size.</w:t>
       </w:r>
     </w:p>
     <w:bookmarkEnd w:id="34"/>
@@ -4590,7 +4590,7 @@
         <w:t xml:space="preserve"> </w:t>
       </w:r>
       <w:r>
-        <w:t xml:space="preserve">DD signal under donor modelling and age adjustment (Braak II versus Braak 0 fixed).</w:t>
+        <w:t xml:space="preserve">DD signal under donor modelling and age adjustment (Braak II versus Braak 0 fixed). P values are unadjusted one-sided hypergeometric P values for the top-200 DD overlap, one test per model.</w:t>
       </w:r>
     </w:p>
     <w:tbl>
@@ -5098,7 +5098,7 @@
         <w:pStyle w:val="BodyText"/>
       </w:pPr>
       <w:r>
-        <w:t xml:space="preserve">In the model adjusted for age and sex, all 20 genes of the DD signature kept the direction they had in the unadjusted model (log2FC correlation 1.000). All six stress genes were higher in advanced AD, and five reached FDR &lt; 0.05 (JUNB: FDR = 0.083). With neuron, astrocyte and microglia marker scores added, all six stayed up and five remained significant (log2FC between 0.27 and 0.44; JUNB: FDR = 0.087). Composition adjustment reduced the number of significant genes across the genome from 9,313 to 4,514. Most of the genes in the neuronal category lost significance after this adjustment; only NRN1 remained down (log2FC from −1.30 to −0.45), and BAIAP2 changed direction. This fits with the bulk decline of these genes being largely a consequence of neuron loss (correlation between neuron score and group r = −0.42). None of the eight genes in the divergent, tumour-specific category remained significant. The astrocyte score did not differ between groups (r = −0.05).</w:t>
+        <w:t xml:space="preserve">In the model adjusted for age and sex, all 20 genes of the DD signature kept the direction they had in the unadjusted model (log2FC correlation 1.000). All six stress genes were higher in advanced AD, and five reached FDR &lt; 0.05 (JUNB: FDR = 0.083). With neuron, astrocyte and microglia marker scores added, all six stayed up and five remained significant (log2FC between 0.27 and 0.44; JUNB: FDR = 0.087). Composition adjustment reduced the number of significant genes across the genome from 9,313 to 4,514 (these counts refer to the Ensembl-level matrix and three marker scores, and differ slightly from those in Section 3.4). Most of the genes in the neuronal category lost significance after this adjustment; only NRN1 remained down (log2FC from −1.30 to −0.45), and BAIAP2 changed direction. This fits with the bulk decline of these genes being largely a consequence of neuron loss (correlation between neuron score and group r = −0.42). None of the eight genes in the divergent, tumour-specific category remained significant. The astrocyte score did not differ between groups (r = −0.05).</w:t>
       </w:r>
     </w:p>
     <w:p>
@@ -5134,7 +5134,7 @@
         <w:pStyle w:val="FirstParagraph"/>
       </w:pPr>
       <w:r>
-        <w:t xml:space="preserve">This study asked, under a plan fixed before any analysis, how much of the transcriptomic convergence reported between AD and GBM survives control for cell composition, and whether any remaining signal corresponds to a shared neural identity at cell-type resolution. The primary hypothesis (H1) was supported. The 1,458 shared DEGs found without composition control fell to zero after adjustment with two different deconvolution approaches. The secondary hypothesis (H2) was rejected, because none of the three pre-specified tests passed in the plan-conformant analysis, in the documented deviation or in the original implementation. Among the publication scenarios defined in the plan, this pattern corresponds to the one in which bulk AD-GBM convergence mostly reflects differences in composition and no detectable overlap exists between the identity of vulnerable AD neurons and the neural-mimicry states of GBM.</w:t>
+        <w:t xml:space="preserve">This study asked, under a plan fixed before any analysis, how much of the transcriptomic convergence reported between AD and GBM survives control for cell composition, and whether any remaining signal corresponds to a shared neural identity at cell-type resolution. The primary hypothesis (H1) was supported. The 1,458 shared DEGs found without composition adjustment fell to zero after adjustment, with BRETIGEA and, formally, with MuSiC. The secondary hypothesis (H2) was rejected, because none of the three pre-specified tests passed in the plan-conformant analysis, in the documented deviation or in the original implementation. Among the publication scenarios defined in the plan, this pattern corresponds to the one in which bulk AD-GBM convergence mostly reflects differences in composition and no detectable overlap exists between the identity of vulnerable AD neurons and the neural-mimicry states of GBM.</w:t>
       </w:r>
     </w:p>
     <w:p>
@@ -5142,7 +5142,7 @@
         <w:pStyle w:val="BodyText"/>
       </w:pPr>
       <w:r>
-        <w:t xml:space="preserve">The two results do not carry the same weight. The H1 result holds across all pre-specified sensitivity analyses, survives a negative control that rules out loss of statistical power, and replicates in an independent AD cohort. Of the two deconvolution methods, only BRETIGEA gave plausible composition estimates, so the weight of the evidence rests on it and on the replication, not on MuSiC. The rejection of H2 has to be read alongside the limited power of the discovery cohort, which I discuss in Section 4.3.</w:t>
+        <w:t xml:space="preserve">The two results do not carry the same weight. The H1 result holds across all pre-specified sensitivity analyses, survives a negative control that rules out loss of statistical power, and replicates, as a marked reduction rather than a complete loss, in an independent AD cohort. Of the two deconvolution methods, only BRETIGEA gave plausible composition estimates, so the weight of the evidence rests on BRETIGEA in two AD cohorts, not on MuSiC. The rejection of H2 has to be read alongside the limited power of the discovery cohort, which I discuss in Section 4.3.</w:t>
       </w:r>
     </w:p>
     <w:bookmarkEnd w:id="38"/>
@@ -5370,7 +5370,7 @@
         <w:pStyle w:val="FirstParagraph"/>
       </w:pPr>
       <w:r>
-        <w:t xml:space="preserve">In two AD cohorts, the transcriptomic signature shared by AD and GBM in bulk tissue did not survive adjustment for estimated cell composition, and the shared genes were lost far more often than disease-associated genes in general. At cell-type resolution, no overlap between vulnerable-neuron identity and the neural-mimicry states of the tumour could be detected with the donors available. A convergence-like signal in the discovery analysis disappeared once age was modelled, while pseudoreplication separately inflated the number of significant genes. Claims of shared biology from cross-disease transcriptomic comparisons are only as reliable as the composition control, donor-level inference and pre-specified analysis behind them.</w:t>
+        <w:t xml:space="preserve">In two AD cohorts, most of the transcriptomic signature shared by AD and GBM in bulk tissue was lost after adjustment for estimated cell composition (all of it in the primary cohort, 93% in the replication cohort), while about half of the AD disease signal remained in the larger cohort. At cell-type resolution, no overlap between vulnerable-neuron identity and the neural-mimicry states of the tumour could be detected with the donors available. A convergence-like signal in the discovery analysis disappeared once age was modelled, while pseudoreplication separately inflated the number of significant genes. Claims of shared biology from cross-disease transcriptomic comparisons are only as reliable as the composition control, donor-level inference and pre-specified analysis behind them.</w:t>
       </w:r>
     </w:p>
     <w:bookmarkEnd w:id="44"/>

</xml_diff>

<commit_message>
Manuscript v4 (EN): title 'markedly reduced after adjustment'; abstract reports both negative-control arms
</commit_message>
<xml_diff>
--- a/manuscript/drafts/manuscript_scenarioB_EN.docx
+++ b/manuscript/drafts/manuscript_scenarioB_EN.docx
@@ -2,7 +2,7 @@
 <file path=word/document.xml><?xml version="1.0" encoding="utf-8"?>
 <w:document xmlns:w="http://schemas.openxmlformats.org/wordprocessingml/2006/main" xmlns:m="http://schemas.openxmlformats.org/officeDocument/2006/math" xmlns:r="http://schemas.openxmlformats.org/officeDocument/2006/relationships" xmlns:o="urn:schemas-microsoft-com:office:office" xmlns:v="urn:schemas-microsoft-com:vml" xmlns:w10="urn:schemas-microsoft-com:office:word" xmlns:a="http://schemas.openxmlformats.org/drawingml/2006/main" xmlns:pic="http://schemas.openxmlformats.org/drawingml/2006/picture" xmlns:wp="http://schemas.openxmlformats.org/drawingml/2006/wordprocessingDrawing">
   <w:body>
-    <w:bookmarkStart w:id="51" w:name="X1561019e2b3943cac2a414e782fad96d1ee90c2"/>
+    <w:bookmarkStart w:id="51" w:name="X7dae26f9ac92f2bfb3c7b20da80471732cca90d"/>
     <w:p>
       <w:pPr>
         <w:pStyle w:val="Heading1"/>
@@ -12,7 +12,7 @@
         <w:rPr>
           <w:sz w:val="32"/>
         </w:rPr>
-        <w:t xml:space="preserve">Shared transcriptomic signatures of Alzheimer’s disease and glioblastoma do not survive adjustment for estimated cell composition: a pre-specified re-evaluation</w:t>
+        <w:t xml:space="preserve">Alzheimer’s disease–glioblastoma transcriptomic overlap is markedly reduced after adjustment for estimated cell composition: a pre-specified re-evaluation</w:t>
       </w:r>
     </w:p>
     <w:p>
@@ -90,7 +90,7 @@
         <w:t xml:space="preserve"> </w:t>
       </w:r>
       <w:r>
-        <w:t xml:space="preserve">Hypotheses, thresholds and decision rules were fixed in a time-stamped plan before analysis. For the primary hypothesis (H1), I compared shared differentially expressed genes (DEGs) between a hippocampal AD meta-cohort (n = 51) and TCGA-GBM/GTEx (n = 338), with and without composition covariates from two pre-specified deconvolution methods, and repeated the test with BRETIGEA in an independent AD cohort (n = 195). For the secondary hypothesis (H2), I tested whether vulnerable RORB+ entorhinal neurons and GBM neural-like malignant states share a signature, using three pre-specified tests. Every deviation from the plan was recorded.</w:t>
+        <w:t xml:space="preserve">Hypotheses and decision rules were fixed in a time-stamped plan before analysis. For the primary hypothesis (H1), I compared shared differentially expressed genes (DEGs) between a hippocampal AD meta-cohort (n = 51) and TCGA-GBM/GTEx (n = 338), with and without composition covariates from two pre-specified deconvolution methods, and repeated the test with BRETIGEA in an independent AD cohort (n = 195). For the secondary hypothesis (H2), I tested whether vulnerable RORB+ entorhinal neurons and GBM neural-like malignant states share a signature, using three pre-specified tests. Every deviation from the plan was recorded.</w:t>
       </w:r>
     </w:p>
     <w:p>
@@ -108,7 +108,7 @@
         <w:t xml:space="preserve"> </w:t>
       </w:r>
       <w:r>
-        <w:t xml:space="preserve">The 1,458 shared DEGs fell to zero with BRETIGEA adjustment, so H1 was supported; MuSiC gave the same count but implausible proportions, and noise covariates did not reproduce the loss. In the independent cohort, BRETIGEA adjustment kept 46% of AD DEGs but only 7% of shared DEGs (3,912 to 288). With three donors per group, H2 failed all three tests in every analysis. A convergence-like signal in the original implementation disappeared when age was modelled but not when donor was modelled; pseudoreplication separately inflated significant genes (486 versus 0–27).</w:t>
+        <w:t xml:space="preserve">The 1,458 shared DEGs fell to zero with BRETIGEA adjustment, so H1 was supported; MuSiC gave the same count but implausible proportions. Independent noise covariates did not reproduce the loss, but components from random genes, which also captured composition, did. In the independent cohort, BRETIGEA adjustment kept 46% of AD DEGs but only 7% of shared DEGs (3,912 to 288). With three donors per group, H2 failed all three tests in every analysis. A convergence-like signal in the original analysis disappeared when age, but not donor, was modelled; pseudoreplication separately inflated significant genes (486 versus 0–27).</w:t>
       </w:r>
     </w:p>
     <w:p>
@@ -2682,7 +2682,14 @@
                 <w:rFonts w:ascii="Times New Roman" w:hAnsi="Times New Roman"/>
                 <w:sz w:val="20"/>
               </w:rPr>
-              <w:t xml:space="preserve">Shortened; H2 clause removed; operational wording (</w:t>
+              <w:t xml:space="preserve">Shortened; H2 clause removed;</w:t>
+            </w:r>
+            <w:r>
+              <w:rPr>
+                <w:rFonts w:ascii="Times New Roman" w:hAnsi="Times New Roman"/>
+                <w:sz w:val="20"/>
+              </w:rPr>
+              <w:t xml:space="preserve"> </w:t>
             </w:r>
             <w:r>
               <w:rPr>
@@ -2696,7 +2703,7 @@
                 <w:rFonts w:ascii="Times New Roman" w:hAnsi="Times New Roman"/>
                 <w:sz w:val="20"/>
               </w:rPr>
-              <w:t xml:space="preserve">adjustment for estimated cell composition</w:t>
+              <w:t xml:space="preserve">markedly reduced after adjustment for estimated cell composition</w:t>
             </w:r>
             <w:r>
               <w:rPr>
@@ -2705,29 +2712,22 @@
               </w:rPr>
               <w:t xml:space="preserve">’</w:t>
             </w:r>
-            <w:r>
-              <w:rPr>
-                <w:rFonts w:ascii="Times New Roman" w:hAnsi="Times New Roman"/>
-                <w:sz w:val="20"/>
-              </w:rPr>
-              <w:t xml:space="preserve">)</w:t>
-            </w:r>
-          </w:p>
-        </w:tc>
-        <w:tc>
-          <w:tcPr/>
-          <w:p>
-            <w:pPr>
-              <w:pStyle w:val="Compact"/>
-              <w:spacing w:line="240" w:lineRule="auto" w:after="0"/>
-              <w:jc w:val="left"/>
-            </w:pPr>
-            <w:r>
-              <w:rPr>
-                <w:rFonts w:ascii="Times New Roman" w:hAnsi="Times New Roman"/>
-                <w:sz w:val="20"/>
-              </w:rPr>
-              <w:t xml:space="preserve">Length; the H2 clause claimed more than a 6-donor analysis can support; composition specificity not shown</w:t>
+          </w:p>
+        </w:tc>
+        <w:tc>
+          <w:tcPr/>
+          <w:p>
+            <w:pPr>
+              <w:pStyle w:val="Compact"/>
+              <w:spacing w:line="240" w:lineRule="auto" w:after="0"/>
+              <w:jc w:val="left"/>
+            </w:pPr>
+            <w:r>
+              <w:rPr>
+                <w:rFonts w:ascii="Times New Roman" w:hAnsi="Times New Roman"/>
+                <w:sz w:val="20"/>
+              </w:rPr>
+              <w:t xml:space="preserve">Length; the H2 clause claimed more than a 6-donor analysis can support; composition specificity not shown; 288 shared DEGs remained in the replication cohort</w:t>
             </w:r>
           </w:p>
         </w:tc>

</xml_diff>

<commit_message>
Manuscript v5 (EN): abstract states MuSiC replaced planned bMIND; Table 1 lists GSE125583 as H1 replication plus exploratory
</commit_message>
<xml_diff>
--- a/manuscript/drafts/manuscript_scenarioB_EN.docx
+++ b/manuscript/drafts/manuscript_scenarioB_EN.docx
@@ -90,7 +90,7 @@
         <w:t xml:space="preserve"> </w:t>
       </w:r>
       <w:r>
-        <w:t xml:space="preserve">Hypotheses and decision rules were fixed in a time-stamped plan before analysis. For the primary hypothesis (H1), I compared shared differentially expressed genes (DEGs) between a hippocampal AD meta-cohort (n = 51) and TCGA-GBM/GTEx (n = 338), with and without composition covariates from two pre-specified deconvolution methods, and repeated the test with BRETIGEA in an independent AD cohort (n = 195). For the secondary hypothesis (H2), I tested whether vulnerable RORB+ entorhinal neurons and GBM neural-like malignant states share a signature, using three pre-specified tests. Every deviation from the plan was recorded.</w:t>
+        <w:t xml:space="preserve">Hypotheses and decision rules were fixed in a time-stamped plan before analysis. For the primary hypothesis (H1), I compared shared differentially expressed genes (DEGs) between a hippocampal AD meta-cohort (n = 51) and TCGA-GBM/GTEx (n = 338), with and without covariates from two deconvolution methods (BRETIGEA, and MuSiC replacing the planned bMIND), and repeated the BRETIGEA test in an independent AD cohort (n = 195). For the secondary hypothesis (H2), three pre-specified tests asked whether vulnerable RORB+ entorhinal neurons and GBM neural-like malignant states share a signature. Every deviation from the plan was recorded.</w:t>
       </w:r>
     </w:p>
     <w:p>
@@ -800,7 +800,7 @@
                 <w:rFonts w:ascii="Times New Roman" w:hAnsi="Times New Roman"/>
                 <w:sz w:val="20"/>
               </w:rPr>
-              <w:t xml:space="preserve">Exploratory only (not in the plan)</w:t>
+              <w:t xml:space="preserve">Not in the plan: independent replication of H1, added after external review and pre-declared before running; exploratory stress-gene analysis</w:t>
             </w:r>
           </w:p>
         </w:tc>

</xml_diff>